<commit_message>
feat: go-to-market audit, farmer statement, consent at sign-up, auth guard on by default
Add farmer statement screen, registration consent, REQUIRE_AUTH flag,
rewrite the product specification, archive the AgroLink chat spec, and
correct the value-proposition document and feature audit.

Co-Authored-By: Claude Sonnet 5.5 <noreply@anthropic.com>
</commit_message>
<xml_diff>
--- a/docs/Transfarmation_Value_Proposition.docx
+++ b/docs/Transfarmation_Value_Proposition.docx
@@ -299,7 +299,7 @@
                 <w:sz w:val="13"/>
                 <w:szCs w:val="13"/>
               </w:rPr>
-              <w:t xml:space="preserve">Modules already built and running</w:t>
+              <w:t xml:space="preserve">Modules built (pilot-readiness being verified)</w:t>
             </w:r>
           </w:p>
         </w:tc>
@@ -570,7 +570,7 @@
           <w:sz w:val="16"/>
           <w:szCs w:val="16"/>
         </w:rPr>
-        <w:t xml:space="preserve">Transfarmation is a single-player-value platform: farmers get standalone utility from day one, with no dependency on other users joining first. The pilot vertical is Zimbabwe’s tobacco industry — a sector that sold ~355 million kg for an estimated US$1.18 billion in the 2025 season, grown by ~115,000 registered farmers (85% small-scale), with contract farming covering an estimated 80–95% of output (TIMB, 2025–26). The platform embeds compliance, financing, and operational workflows directly into the farmer’s experience under the Tobacco Industry and Marketing Act [Chapter 18:20], making it indispensable to the smallholder while solving side-marketing, financing, and compliance problems for contractors and regulators. The same model is designed to generalise to perishable horticulture (starting with tomatoes) without starting over.</w:t>
+        <w:t xml:space="preserve">Transfarmation is a single-player-value platform: farmers get standalone utility from day one, with no dependency on other users joining first. The pilot vertical is Zimbabwe’s tobacco industry — a sector that sold ~357 million kg for about US$889 million in the 2026 season (down 24% from US$1.17 billion in 2025 as oversupply and weak prices hit), grown by ~115,000 registered farmers (85% small-scale, ~97,000 contracted), with contract farming covering the large majority of output (TIMB, 2025–26). The platform embeds debt transparency, financing and compliance workflows directly into the farmer’s experience under the Tobacco Industry and Marketing Act [Chapter 18:20], making it indispensable to the smallholder while helping contractors and regulators reduce default, side-marketing and compliance costs. The same model is designed to generalise to perishable horticulture (starting with tomatoes), with its own buyer and go-to-market work.</w:t>
       </w:r>
     </w:p>
     <w:p>
@@ -892,7 +892,7 @@
           <w:sz w:val="27"/>
           <w:szCs w:val="27"/>
         </w:rPr>
-        <w:t xml:space="preserve">A US$1.18 billion sector losing US$57 million a year to a problem this platform solves</w:t>
+        <w:t xml:space="preserve">A ~US$0.9 billion sector where smallholders are squeezed by input debt and weak prices</w:t>
       </w:r>
     </w:p>
     <w:p>
@@ -908,7 +908,7 @@
           <w:sz w:val="12"/>
           <w:szCs w:val="12"/>
         </w:rPr>
-        <w:t xml:space="preserve">Figures below are drawn from TIMB season data as reported in Zimbabwean business press (2025–26); treat them as directional, not audited.</w:t>
+        <w:t xml:space="preserve">Figures below are drawn from TIMB season data as reported in Zimbabwean business press (2025–26); treat them as directional, not audited. Re-verify against TIMB before external use.</w:t>
       </w:r>
     </w:p>
     <w:tbl>
@@ -960,7 +960,7 @@
                 <w:sz w:val="28"/>
                 <w:szCs w:val="28"/>
               </w:rPr>
-              <w:t xml:space="preserve">$1.18B</w:t>
+              <w:t xml:space="preserve">$889M</w:t>
             </w:r>
           </w:p>
           <w:p>
@@ -971,7 +971,7 @@
                 <w:sz w:val="13"/>
                 <w:szCs w:val="13"/>
               </w:rPr>
-              <w:t xml:space="preserve">2025 tobacco season earnings — a national record</w:t>
+              <w:t xml:space="preserve">2026 tobacco season sales, down 24% from US$1.17B in 2025</w:t>
             </w:r>
           </w:p>
         </w:tc>
@@ -1050,7 +1050,7 @@
                 <w:sz w:val="28"/>
                 <w:szCs w:val="28"/>
               </w:rPr>
-              <w:t xml:space="preserve">$57M</w:t>
+              <w:t xml:space="preserve">24%</w:t>
             </w:r>
           </w:p>
           <w:p>
@@ -1061,7 +1061,7 @@
                 <w:sz w:val="13"/>
                 <w:szCs w:val="13"/>
               </w:rPr>
-              <w:t xml:space="preserve">Estimated annual cost of side-marketing alone</w:t>
+              <w:t xml:space="preserve">Fall in sales value in 2026, with volume steady at ~357M kg</w:t>
             </w:r>
           </w:p>
         </w:tc>
@@ -1106,7 +1106,7 @@
                 <w:sz w:val="13"/>
                 <w:szCs w:val="13"/>
               </w:rPr>
-              <w:t xml:space="preserve">Land under tobacco, and still expanding</w:t>
+              <w:t xml:space="preserve">Land under tobacco (to be re-verified with TIMB)</w:t>
             </w:r>
           </w:p>
         </w:tc>
@@ -1145,7 +1145,7 @@
           <w:sz w:val="13"/>
           <w:szCs w:val="13"/>
         </w:rPr>
-        <w:t xml:space="preserve">No existing platform, in Zimbabwe or the region, combines TIMB-grade regulatory compliance with farmer-first financing — even the closest local competitor stops at diagnosis and credit scoring.</w:t>
+        <w:t xml:space="preserve">Local players already serve parts of the tobacco chain — ModernLeaf AI, MukuruPay, EcoFarmer/VAYA, Kurima Mari and eAgro among them. None combines farmer-first debt transparency, financing and compliance in one offline-first product. TIMB itself now runs the biometric registry, so the opportunity is integration, not ownership.</w:t>
       </w:r>
     </w:p>
     <w:tbl>
@@ -1710,7 +1710,7 @@
           <w:sz w:val="10"/>
           <w:szCs w:val="10"/>
         </w:rPr>
-        <w:t xml:space="preserve">Sources: TIMB season data via Business Times, AllAfrica and Equity Axis (2025–26); competitor data via eAgro, Agri AI (Google Play), AgFunder News, GSMA and FAO AgriTech Observatory.</w:t>
+        <w:t xml:space="preserve">Sources: TIMB season data via Business Times, AllAfrica, Equity Axis, The Star and Farmers Weekly (2025–26); competitor data via eAgro, Agri AI (Google Play), AgFunder News, GSMA, FAO AgriTech Observatory, TIMB-related press. Full audit: docs/go_to_market_audit.md.</w:t>
       </w:r>
     </w:p>
     <w:p>
@@ -1904,7 +1904,7 @@
                 <w:sz w:val="12"/>
                 <w:szCs w:val="12"/>
               </w:rPr>
-              <w:t xml:space="preserve">Requires a regulator MoU, not just engineering — a real head start for anyone starting today</w:t>
+              <w:t xml:space="preserve">Requires a regulator MoU and TIMB access. TIMB already runs the biometric registry, so this is a head start only if access is granted. The product must work without it.</w:t>
             </w:r>
           </w:p>
         </w:tc>
@@ -2754,7 +2754,7 @@
           <w:sz w:val="16"/>
           <w:szCs w:val="16"/>
         </w:rPr>
-        <w:t xml:space="preserve">Side-marketing leaks contracted tobacco to unauthorised buyers — TIMB estimates this costs the sector US$57 million a year</w:t>
+        <w:t xml:space="preserve">Side-marketing leaks contracted tobacco to unauthorised buyers, and many farmers end the season with negative balances after input-debt recovery</w:t>
       </w:r>
     </w:p>
     <w:p>
@@ -6588,7 +6588,7 @@
                 <w:sz w:val="11"/>
                 <w:szCs w:val="11"/>
               </w:rPr>
-              <w:t xml:space="preserve">Gate: signed MoU &amp; working TIMB integration; data-protection licence obtained</w:t>
+              <w:t xml:space="preserve">Gate: signed MoU &amp; working TIMB integration. The POTRAZ data-controller licence is needed earlier, before the first pilot farmers are onboarded</w:t>
             </w:r>
           </w:p>
         </w:tc>
@@ -6828,7 +6828,7 @@
                 <w:sz w:val="12"/>
                 <w:szCs w:val="12"/>
               </w:rPr>
-              <w:t xml:space="preserve">26 modules already built and running today — the technical foundation Phase 1 builds on</w:t>
+              <w:t xml:space="preserve">26 modules built; the pilot-ready subset (offline sync, sign-in, consent, farmer statement) is being hardened. The technical foundation Phase 1 builds on</w:t>
             </w:r>
           </w:p>
           <w:p>
@@ -8763,7 +8763,7 @@
                 <w:sz w:val="13"/>
                 <w:szCs w:val="13"/>
               </w:rPr>
-              <w:t xml:space="preserve">Transactions &amp; Escrow</w:t>
+              <w:t xml:space="preserve">Input Credit &amp; Contracts</w:t>
             </w:r>
           </w:p>
           <w:p>
@@ -8774,7 +8774,7 @@
                 <w:sz w:val="11"/>
                 <w:szCs w:val="11"/>
               </w:rPr>
-              <w:t xml:space="preserve">Input vouchers, freight bookings, disputes logged</w:t>
+              <w:t xml:space="preserve">Input vouchers through a licensed bank/PSP partner, signed contracts, disputes logged</w:t>
             </w:r>
           </w:p>
         </w:tc>
@@ -8820,7 +8820,7 @@
                 <w:sz w:val="13"/>
                 <w:szCs w:val="13"/>
               </w:rPr>
-              <w:t xml:space="preserve">Market Live-Fire Test</w:t>
+              <w:t xml:space="preserve">Settlement Test</w:t>
             </w:r>
           </w:p>
           <w:p>
@@ -8831,7 +8831,7 @@
                 <w:sz w:val="11"/>
                 <w:szCs w:val="11"/>
               </w:rPr>
-              <w:t xml:space="preserve">Auction floor sync, waterfall settlement, payout inside the hour</w:t>
+              <w:t xml:space="preserve">Tomato harvest sale with partner-bank payout now; tobacco auction-floor sync and payout test in the March 2027 marketing season</w:t>
             </w:r>
           </w:p>
         </w:tc>
@@ -9024,7 +9024,7 @@
                 <w:sz w:val="14"/>
                 <w:szCs w:val="14"/>
               </w:rPr>
-              <w:t xml:space="preserve">Open engagement with TIMB &amp; POTRAZ; support the MoU and data-protection licensing process</w:t>
+              <w:t xml:space="preserve">Open engagement with TIMB; support the MoU. Secure the POTRAZ data-controller licence and a data protection officer before onboarding farmers</w:t>
             </w:r>
           </w:p>
           <w:p>

</xml_diff>